<commit_message>
Keep acronyms in capitals in the AI whiteboard prompts
board_spec sentence-cased all-caps labels with .capitalize(), turning
"CD3 · CALLED WSJF IN SAFe" into "Cd3 · called wsjf in safe". A new
_case() keeps known acronyms, mixed-case words and RACI-style key letters.

Co-Authored-By: Claude Opus 5.5 <noreply@anthropic.com>
</commit_message>
<xml_diff>
--- a/facilitator-guide-prioritisation.docx
+++ b/facilitator-guide-prioritisation.docx
@@ -991,12 +991,12 @@
     </w:p>
     <w:p>
       <w:r>
-        <w:t xml:space="preserve">   Subtitle: Cd3 · called wsjf in safe · highest score first</w:t>
-      </w:r>
-    </w:p>
-    <w:p>
-      <w:r>
-        <w:t xml:space="preserve">   Content: Score one column at a time across all items: 1, 2, 3, 5, 8, 13 (smallest item = 1). CoD = value + time + risk. · Item: · Value: · Time: · Risk / opp.: · Cod: · Job size: · Cod / size: · Rank:</w:t>
+        <w:t xml:space="preserve">   Subtitle: CD3 · called WSJF in SAFe · highest score first</w:t>
+      </w:r>
+    </w:p>
+    <w:p>
+      <w:r>
+        <w:t xml:space="preserve">   Content: Score one column at a time across all items: 1, 2, 3, 5, 8, 13 (smallest item = 1). CoD = value + time + risk. · Item: · Value: · Time: · Risk / opp.: · CoD: · Job size: · CoD / size: · Rank:</w:t>
       </w:r>
     </w:p>
     <w:p>

</xml_diff>